<commit_message>
Fixed Note deleting feature
</commit_message>
<xml_diff>
--- a/docs/lab2.docx
+++ b/docs/lab2.docx
@@ -192,9 +192,20 @@
           <w:color w:val="000000"/>
           <w:sz w:val="28"/>
           <w:szCs w:val="28"/>
-          <w:lang w:eastAsia="ru-RU"/>
-        </w:rPr>
-        <w:t>&lt;НАЗВАНИЕ РАБОТЫ&gt;</w:t>
+          <w:lang w:val="en-US" w:eastAsia="ru-RU"/>
+        </w:rPr>
+        <w:t xml:space="preserve">MAUI. </w:t>
+      </w:r>
+      <w:r>
+        <w:rPr>
+          <w:rFonts w:ascii="Times New Roman" w:eastAsia="Times New Roman" w:hAnsi="Times New Roman" w:cs="Times New Roman"/>
+          <w:bCs/>
+          <w:color w:val="000000"/>
+          <w:sz w:val="28"/>
+          <w:szCs w:val="28"/>
+          <w:lang w:eastAsia="ru-RU"/>
+        </w:rPr>
+        <w:t>ХРАНЕНИЕ ДАННЫХ</w:t>
       </w:r>
     </w:p>
     <w:p>
@@ -259,7 +270,40 @@
           <w:szCs w:val="28"/>
           <w:lang w:eastAsia="ru-RU"/>
         </w:rPr>
-        <w:t>по лабораторной работе по дисциплине </w:t>
+        <w:t>по лабораторной работе</w:t>
+      </w:r>
+      <w:r>
+        <w:rPr>
+          <w:rFonts w:ascii="Times New Roman" w:eastAsia="Times New Roman" w:hAnsi="Times New Roman" w:cs="Times New Roman"/>
+          <w:iCs/>
+          <w:color w:val="000000"/>
+          <w:sz w:val="28"/>
+          <w:szCs w:val="28"/>
+          <w:lang w:eastAsia="ru-RU"/>
+        </w:rPr>
+        <w:t xml:space="preserve"> </w:t>
+      </w:r>
+      <w:r>
+        <w:rPr>
+          <w:rFonts w:ascii="Times New Roman" w:eastAsia="Times New Roman" w:hAnsi="Times New Roman" w:cs="Times New Roman"/>
+          <w:iCs/>
+          <w:color w:val="000000"/>
+          <w:sz w:val="28"/>
+          <w:szCs w:val="28"/>
+          <w:lang w:eastAsia="ru-RU"/>
+        </w:rPr>
+        <w:t>№2</w:t>
+      </w:r>
+      <w:r>
+        <w:rPr>
+          <w:rFonts w:ascii="Times New Roman" w:eastAsia="Times New Roman" w:hAnsi="Times New Roman" w:cs="Times New Roman"/>
+          <w:iCs/>
+          <w:color w:val="000000"/>
+          <w:sz w:val="28"/>
+          <w:szCs w:val="28"/>
+          <w:lang w:eastAsia="ru-RU"/>
+        </w:rPr>
+        <w:t xml:space="preserve"> по дисциплине </w:t>
       </w:r>
     </w:p>
     <w:p>
@@ -283,6 +327,17 @@
           <w:lang w:eastAsia="ru-RU"/>
         </w:rPr>
         <w:t>“</w:t>
+      </w:r>
+      <w:r>
+        <w:rPr>
+          <w:rFonts w:ascii="Times New Roman" w:eastAsia="Times New Roman" w:hAnsi="Times New Roman" w:cs="Times New Roman"/>
+          <w:iCs/>
+          <w:color w:val="000000"/>
+          <w:sz w:val="28"/>
+          <w:szCs w:val="28"/>
+          <w:lang w:eastAsia="ru-RU"/>
+        </w:rPr>
+        <w:t>Разработка мобильных приложений</w:t>
       </w:r>
       <w:r>
         <w:rPr>
@@ -725,7 +780,7 @@
                 <w:szCs w:val="28"/>
                 <w:lang w:eastAsia="ru-RU"/>
               </w:rPr>
-              <w:t>(должность, ученая</w:t>
+              <w:t>Старший преподаватель кафедры КСУП</w:t>
             </w:r>
           </w:p>
           <w:p>
@@ -749,21 +804,8 @@
                 <w:szCs w:val="28"/>
                 <w:lang w:eastAsia="ru-RU"/>
               </w:rPr>
-              <w:t>степень, звание)</w:t>
+              <w:t xml:space="preserve">_______ </w:t>
             </w:r>
-          </w:p>
-          <w:p>
-            <w:pPr>
-              <w:spacing w:line="360" w:lineRule="auto"/>
-              <w:rPr>
-                <w:rFonts w:ascii="Times New Roman" w:eastAsia="Times New Roman" w:hAnsi="Times New Roman" w:cs="Times New Roman"/>
-                <w:iCs/>
-                <w:color w:val="000000"/>
-                <w:sz w:val="28"/>
-                <w:szCs w:val="28"/>
-                <w:lang w:eastAsia="ru-RU"/>
-              </w:rPr>
-            </w:pPr>
             <w:r>
               <w:rPr>
                 <w:rFonts w:ascii="Times New Roman" w:eastAsia="Times New Roman" w:hAnsi="Times New Roman" w:cs="Times New Roman"/>
@@ -773,7 +815,7 @@
                 <w:szCs w:val="28"/>
                 <w:lang w:eastAsia="ru-RU"/>
               </w:rPr>
-              <w:t>_______ И.О.Фамилия</w:t>
+              <w:t>Е.С.Мурзин</w:t>
             </w:r>
           </w:p>
           <w:p>
@@ -813,7 +855,7 @@
           <w:color w:val="000000"/>
           <w:sz w:val="28"/>
           <w:szCs w:val="28"/>
-          <w:lang w:val="en-US" w:eastAsia="ru-RU"/>
+          <w:lang w:eastAsia="ru-RU"/>
         </w:rPr>
       </w:pPr>
     </w:p>
@@ -936,6 +978,42 @@
           <w:szCs w:val="28"/>
         </w:rPr>
       </w:pPr>
+      <w:r>
+        <w:rPr>
+          <w:rFonts w:ascii="Times New Roman" w:hAnsi="Times New Roman" w:cs="Times New Roman"/>
+          <w:b/>
+          <w:sz w:val="28"/>
+          <w:szCs w:val="28"/>
+        </w:rPr>
+        <w:tab/>
+      </w:r>
+      <w:r>
+        <w:rPr>
+          <w:rFonts w:ascii="Times New Roman" w:hAnsi="Times New Roman" w:cs="Times New Roman"/>
+          <w:sz w:val="28"/>
+          <w:szCs w:val="28"/>
+        </w:rPr>
+        <w:t>В данной лабораторной работе было необходимо изучить механизм сохранения данных на локальном устройстве мобильного приложения. Затем полученные знания необходимо было применить на практике.</w:t>
+      </w:r>
+    </w:p>
+    <w:p>
+      <w:pPr>
+        <w:rPr>
+          <w:rFonts w:ascii="Times New Roman" w:hAnsi="Times New Roman" w:cs="Times New Roman"/>
+          <w:b/>
+          <w:sz w:val="28"/>
+          <w:szCs w:val="28"/>
+        </w:rPr>
+      </w:pPr>
+      <w:r>
+        <w:rPr>
+          <w:rFonts w:ascii="Times New Roman" w:hAnsi="Times New Roman" w:cs="Times New Roman"/>
+          <w:b/>
+          <w:sz w:val="28"/>
+          <w:szCs w:val="28"/>
+        </w:rPr>
+        <w:br w:type="page"/>
+      </w:r>
     </w:p>
     <w:p>
       <w:pPr>
@@ -955,7 +1033,17 @@
           <w:sz w:val="28"/>
           <w:szCs w:val="28"/>
         </w:rPr>
-        <w:t>1 ОСНОВНАЯ ЧАСТЬ</w:t>
+        <w:lastRenderedPageBreak/>
+        <w:t xml:space="preserve">1 </w:t>
+      </w:r>
+      <w:r>
+        <w:rPr>
+          <w:rFonts w:ascii="Times New Roman" w:hAnsi="Times New Roman" w:cs="Times New Roman"/>
+          <w:b/>
+          <w:sz w:val="28"/>
+          <w:szCs w:val="28"/>
+        </w:rPr>
+        <w:t>ДОРАБОТКА ПРИЛОЖЕНИЯ</w:t>
       </w:r>
     </w:p>
     <w:p>
@@ -966,15 +1054,352 @@
           <w:rFonts w:ascii="Times New Roman" w:hAnsi="Times New Roman" w:cs="Times New Roman"/>
           <w:sz w:val="28"/>
           <w:szCs w:val="28"/>
+        </w:rPr>
+      </w:pPr>
+      <w:r>
+        <w:rPr>
+          <w:rFonts w:ascii="Times New Roman" w:hAnsi="Times New Roman" w:cs="Times New Roman"/>
+          <w:sz w:val="28"/>
+          <w:szCs w:val="28"/>
+        </w:rPr>
+        <w:tab/>
+        <w:t>Для лабораторной работы б</w:t>
+      </w:r>
+      <w:r>
+        <w:rPr>
+          <w:rFonts w:ascii="Times New Roman" w:hAnsi="Times New Roman" w:cs="Times New Roman"/>
+          <w:sz w:val="28"/>
+          <w:szCs w:val="28"/>
+        </w:rPr>
+        <w:t>ыло</w:t>
+      </w:r>
+      <w:r>
+        <w:rPr>
+          <w:rFonts w:ascii="Times New Roman" w:hAnsi="Times New Roman" w:cs="Times New Roman"/>
+          <w:sz w:val="28"/>
+          <w:szCs w:val="28"/>
+        </w:rPr>
+        <w:t xml:space="preserve"> дополнено приложение Ежедневника, разработанного еще в первой работе.</w:t>
+      </w:r>
+      <w:r>
+        <w:rPr>
+          <w:rFonts w:ascii="Times New Roman" w:hAnsi="Times New Roman" w:cs="Times New Roman"/>
+          <w:sz w:val="28"/>
+          <w:szCs w:val="28"/>
+        </w:rPr>
+        <w:t xml:space="preserve"> В данном приложени</w:t>
+      </w:r>
+      <w:r>
+        <w:rPr>
+          <w:rFonts w:ascii="Times New Roman" w:hAnsi="Times New Roman" w:cs="Times New Roman"/>
+          <w:sz w:val="28"/>
+          <w:szCs w:val="28"/>
+        </w:rPr>
+        <w:t>и</w:t>
+      </w:r>
+      <w:r>
+        <w:rPr>
+          <w:rFonts w:ascii="Times New Roman" w:hAnsi="Times New Roman" w:cs="Times New Roman"/>
+          <w:sz w:val="28"/>
+          <w:szCs w:val="28"/>
+        </w:rPr>
+        <w:t xml:space="preserve"> будет доработан функционал, позволяющий сохранять заметки, а также загружать их при повторном заходе.</w:t>
+      </w:r>
+      <w:r>
+        <w:rPr>
+          <w:rFonts w:ascii="Times New Roman" w:hAnsi="Times New Roman" w:cs="Times New Roman"/>
+          <w:sz w:val="28"/>
+          <w:szCs w:val="28"/>
+        </w:rPr>
+        <w:t xml:space="preserve"> Для этой цели был реализован синглтон</w:t>
+      </w:r>
+      <w:r>
+        <w:rPr>
+          <w:rFonts w:ascii="Times New Roman" w:hAnsi="Times New Roman" w:cs="Times New Roman"/>
+          <w:sz w:val="28"/>
+          <w:szCs w:val="28"/>
+        </w:rPr>
+        <w:t xml:space="preserve"> </w:t>
+      </w:r>
+      <w:r>
+        <w:rPr>
+          <w:rFonts w:ascii="Times New Roman" w:hAnsi="Times New Roman" w:cs="Times New Roman"/>
+          <w:sz w:val="28"/>
+          <w:szCs w:val="28"/>
+        </w:rPr>
+        <w:t>класс</w:t>
+      </w:r>
+      <w:r>
+        <w:rPr>
+          <w:rFonts w:ascii="Times New Roman" w:hAnsi="Times New Roman" w:cs="Times New Roman"/>
+          <w:sz w:val="28"/>
+          <w:szCs w:val="28"/>
+        </w:rPr>
+        <w:t xml:space="preserve"> </w:t>
+      </w:r>
+      <w:r>
+        <w:rPr>
+          <w:rFonts w:ascii="Times New Roman" w:hAnsi="Times New Roman" w:cs="Times New Roman"/>
+          <w:sz w:val="28"/>
+          <w:szCs w:val="28"/>
           <w:lang w:val="en-US"/>
         </w:rPr>
-      </w:pPr>
-    </w:p>
-    <w:p>
-      <w:pPr>
-        <w:spacing w:after="0" w:line="360" w:lineRule="auto"/>
+        <w:t>SQLiteOperator</w:t>
+      </w:r>
+      <w:r>
+        <w:rPr>
+          <w:rFonts w:ascii="Times New Roman" w:hAnsi="Times New Roman" w:cs="Times New Roman"/>
+          <w:sz w:val="28"/>
+          <w:szCs w:val="28"/>
+        </w:rPr>
+        <w:t>, реализующий глобальные операции с локальной БД.</w:t>
+      </w:r>
+    </w:p>
+    <w:p>
+      <w:pPr>
+        <w:keepNext/>
+        <w:spacing w:after="0" w:line="240" w:lineRule="auto"/>
         <w:jc w:val="center"/>
         <w:rPr>
+          <w:color w:val="000000" w:themeColor="text1"/>
+          <w:sz w:val="28"/>
+          <w:szCs w:val="28"/>
+        </w:rPr>
+      </w:pPr>
+      <w:r>
+        <w:rPr>
+          <w:rFonts w:ascii="Times New Roman" w:hAnsi="Times New Roman" w:cs="Times New Roman"/>
+          <w:noProof/>
+          <w:color w:val="000000" w:themeColor="text1"/>
+          <w:sz w:val="28"/>
+          <w:szCs w:val="28"/>
+          <w:lang w:eastAsia="ru-RU"/>
+        </w:rPr>
+        <w:drawing>
+          <wp:inline distT="0" distB="0" distL="0" distR="0">
+            <wp:extent cx="4042225" cy="6942896"/>
+            <wp:effectExtent l="19050" t="0" r="0" b="0"/>
+            <wp:docPr id="1" name="Рисунок 1"/>
+            <wp:cNvGraphicFramePr>
+              <a:graphicFrameLocks xmlns:a="http://schemas.openxmlformats.org/drawingml/2006/main" noChangeAspect="1"/>
+            </wp:cNvGraphicFramePr>
+            <a:graphic xmlns:a="http://schemas.openxmlformats.org/drawingml/2006/main">
+              <a:graphicData uri="http://schemas.openxmlformats.org/drawingml/2006/picture">
+                <pic:pic xmlns:pic="http://schemas.openxmlformats.org/drawingml/2006/picture">
+                  <pic:nvPicPr>
+                    <pic:cNvPr id="0" name="Picture 1"/>
+                    <pic:cNvPicPr>
+                      <a:picLocks noChangeAspect="1" noChangeArrowheads="1"/>
+                    </pic:cNvPicPr>
+                  </pic:nvPicPr>
+                  <pic:blipFill>
+                    <a:blip r:embed="rId7"/>
+                    <a:srcRect/>
+                    <a:stretch>
+                      <a:fillRect/>
+                    </a:stretch>
+                  </pic:blipFill>
+                  <pic:spPr bwMode="auto">
+                    <a:xfrm>
+                      <a:off x="0" y="0"/>
+                      <a:ext cx="4045346" cy="6948257"/>
+                    </a:xfrm>
+                    <a:prstGeom prst="rect">
+                      <a:avLst/>
+                    </a:prstGeom>
+                    <a:noFill/>
+                    <a:ln w="9525">
+                      <a:noFill/>
+                      <a:miter lim="800000"/>
+                      <a:headEnd/>
+                      <a:tailEnd/>
+                    </a:ln>
+                  </pic:spPr>
+                </pic:pic>
+              </a:graphicData>
+            </a:graphic>
+          </wp:inline>
+        </w:drawing>
+      </w:r>
+    </w:p>
+    <w:p>
+      <w:pPr>
+        <w:pStyle w:val="ab"/>
+        <w:spacing w:after="0"/>
+        <w:jc w:val="center"/>
+        <w:rPr>
+          <w:rFonts w:ascii="Times New Roman" w:hAnsi="Times New Roman" w:cs="Times New Roman"/>
+          <w:b w:val="0"/>
+          <w:color w:val="000000" w:themeColor="text1"/>
+          <w:sz w:val="28"/>
+          <w:szCs w:val="28"/>
+        </w:rPr>
+      </w:pPr>
+      <w:r>
+        <w:rPr>
+          <w:b w:val="0"/>
+          <w:color w:val="000000" w:themeColor="text1"/>
+          <w:sz w:val="28"/>
+          <w:szCs w:val="28"/>
+        </w:rPr>
+        <w:t xml:space="preserve">Рисунок </w:t>
+      </w:r>
+      <w:r>
+        <w:rPr>
+          <w:b w:val="0"/>
+          <w:color w:val="000000" w:themeColor="text1"/>
+          <w:sz w:val="28"/>
+          <w:szCs w:val="28"/>
+        </w:rPr>
+        <w:fldChar w:fldCharType="begin"/>
+      </w:r>
+      <w:r>
+        <w:rPr>
+          <w:b w:val="0"/>
+          <w:color w:val="000000" w:themeColor="text1"/>
+          <w:sz w:val="28"/>
+          <w:szCs w:val="28"/>
+        </w:rPr>
+        <w:instrText xml:space="preserve"> SEQ Рисунок \* ARABIC </w:instrText>
+      </w:r>
+      <w:r>
+        <w:rPr>
+          <w:b w:val="0"/>
+          <w:color w:val="000000" w:themeColor="text1"/>
+          <w:sz w:val="28"/>
+          <w:szCs w:val="28"/>
+        </w:rPr>
+        <w:fldChar w:fldCharType="separate"/>
+      </w:r>
+      <w:r>
+        <w:rPr>
+          <w:b w:val="0"/>
+          <w:noProof/>
+          <w:color w:val="000000" w:themeColor="text1"/>
+          <w:sz w:val="28"/>
+          <w:szCs w:val="28"/>
+        </w:rPr>
+        <w:t>1</w:t>
+      </w:r>
+      <w:r>
+        <w:rPr>
+          <w:b w:val="0"/>
+          <w:color w:val="000000" w:themeColor="text1"/>
+          <w:sz w:val="28"/>
+          <w:szCs w:val="28"/>
+        </w:rPr>
+        <w:fldChar w:fldCharType="end"/>
+      </w:r>
+      <w:r>
+        <w:rPr>
+          <w:b w:val="0"/>
+          <w:color w:val="000000" w:themeColor="text1"/>
+          <w:sz w:val="28"/>
+          <w:szCs w:val="28"/>
+        </w:rPr>
+        <w:t xml:space="preserve"> - Синглтон </w:t>
+      </w:r>
+      <w:r>
+        <w:rPr>
+          <w:b w:val="0"/>
+          <w:color w:val="000000" w:themeColor="text1"/>
+          <w:sz w:val="28"/>
+          <w:szCs w:val="28"/>
+          <w:lang w:val="en-US"/>
+        </w:rPr>
+        <w:t>SQLiteOperator</w:t>
+      </w:r>
+    </w:p>
+    <w:p>
+      <w:pPr>
+        <w:spacing w:after="0" w:line="360" w:lineRule="auto"/>
+        <w:jc w:val="both"/>
+        <w:rPr>
+          <w:rFonts w:ascii="Times New Roman" w:hAnsi="Times New Roman" w:cs="Times New Roman"/>
+          <w:sz w:val="28"/>
+          <w:szCs w:val="28"/>
+        </w:rPr>
+      </w:pPr>
+      <w:r>
+        <w:rPr>
+          <w:rFonts w:ascii="Times New Roman" w:hAnsi="Times New Roman" w:cs="Times New Roman"/>
+          <w:sz w:val="28"/>
+          <w:szCs w:val="28"/>
+        </w:rPr>
+        <w:lastRenderedPageBreak/>
+        <w:tab/>
+        <w:t xml:space="preserve">Также незначительно был модифицирован класс заметки </w:t>
+      </w:r>
+      <w:r>
+        <w:rPr>
+          <w:rFonts w:ascii="Times New Roman" w:hAnsi="Times New Roman" w:cs="Times New Roman"/>
+          <w:sz w:val="28"/>
+          <w:szCs w:val="28"/>
+          <w:lang w:val="en-US"/>
+        </w:rPr>
+        <w:t>Note</w:t>
+      </w:r>
+      <w:r>
+        <w:rPr>
+          <w:rFonts w:ascii="Times New Roman" w:hAnsi="Times New Roman" w:cs="Times New Roman"/>
+          <w:sz w:val="28"/>
+          <w:szCs w:val="28"/>
+        </w:rPr>
+        <w:t>.</w:t>
+      </w:r>
+      <w:r>
+        <w:rPr>
+          <w:rFonts w:ascii="Times New Roman" w:hAnsi="Times New Roman" w:cs="Times New Roman"/>
+          <w:sz w:val="28"/>
+          <w:szCs w:val="28"/>
+          <w:lang w:val="en-US"/>
+        </w:rPr>
+        <w:t>cs</w:t>
+      </w:r>
+      <w:r>
+        <w:rPr>
+          <w:rFonts w:ascii="Times New Roman" w:hAnsi="Times New Roman" w:cs="Times New Roman"/>
+          <w:sz w:val="28"/>
+          <w:szCs w:val="28"/>
+        </w:rPr>
+        <w:t xml:space="preserve"> с добавлением модифицированных атрибутов</w:t>
+      </w:r>
+    </w:p>
+    <w:p>
+      <w:pPr>
+        <w:spacing w:after="0" w:line="360" w:lineRule="auto"/>
+        <w:jc w:val="both"/>
+        <w:rPr>
+          <w:rFonts w:ascii="Times New Roman" w:hAnsi="Times New Roman" w:cs="Times New Roman"/>
+          <w:sz w:val="28"/>
+          <w:szCs w:val="28"/>
+        </w:rPr>
+      </w:pPr>
+    </w:p>
+    <w:p>
+      <w:pPr>
+        <w:spacing w:after="0" w:line="360" w:lineRule="auto"/>
+        <w:jc w:val="both"/>
+        <w:rPr>
+          <w:rFonts w:ascii="Times New Roman" w:hAnsi="Times New Roman" w:cs="Times New Roman"/>
+          <w:sz w:val="28"/>
+          <w:szCs w:val="28"/>
+        </w:rPr>
+      </w:pPr>
+      <w:r>
+        <w:rPr>
+          <w:rFonts w:ascii="Times New Roman" w:hAnsi="Times New Roman" w:cs="Times New Roman"/>
+          <w:sz w:val="28"/>
+          <w:szCs w:val="28"/>
+        </w:rPr>
+        <w:tab/>
+      </w:r>
+    </w:p>
+    <w:p>
+      <w:pPr>
+        <w:spacing w:after="0" w:line="360" w:lineRule="auto"/>
+        <w:jc w:val="center"/>
+        <w:rPr>
           <w:rFonts w:ascii="Times New Roman" w:hAnsi="Times New Roman" w:cs="Times New Roman"/>
           <w:b/>
           <w:sz w:val="28"/>
@@ -1003,7 +1428,7 @@
       </w:pPr>
     </w:p>
     <w:sectPr>
-      <w:footerReference w:type="default" r:id="rId7"/>
+      <w:footerReference w:type="default" r:id="rId8"/>
       <w:pgSz w:w="11906" w:h="16838"/>
       <w:pgMar w:top="1134" w:right="850" w:bottom="1134" w:left="1701" w:header="708" w:footer="708" w:gutter="0"/>
       <w:cols w:space="708"/>
@@ -1082,7 +1507,7 @@
             <w:sz w:val="28"/>
             <w:szCs w:val="28"/>
           </w:rPr>
-          <w:t>2</w:t>
+          <w:t>4</w:t>
         </w:r>
         <w:r>
           <w:rPr>
@@ -1410,6 +1835,55 @@
     <w:uiPriority w:val="99"/>
     <w:rsid w:val="00B71F59"/>
   </w:style>
+  <w:style w:type="paragraph" w:styleId="a9">
+    <w:name w:val="Balloon Text"/>
+    <w:basedOn w:val="a"/>
+    <w:link w:val="aa"/>
+    <w:uiPriority w:val="99"/>
+    <w:semiHidden/>
+    <w:unhideWhenUsed/>
+    <w:rsid w:val="000D4660"/>
+    <w:pPr>
+      <w:spacing w:after="0" w:line="240" w:lineRule="auto"/>
+    </w:pPr>
+    <w:rPr>
+      <w:rFonts w:ascii="Tahoma" w:hAnsi="Tahoma" w:cs="Tahoma"/>
+      <w:sz w:val="16"/>
+      <w:szCs w:val="16"/>
+    </w:rPr>
+  </w:style>
+  <w:style w:type="character" w:customStyle="1" w:styleId="aa">
+    <w:name w:val="Текст выноски Знак"/>
+    <w:basedOn w:val="a0"/>
+    <w:link w:val="a9"/>
+    <w:uiPriority w:val="99"/>
+    <w:semiHidden/>
+    <w:rsid w:val="000D4660"/>
+    <w:rPr>
+      <w:rFonts w:ascii="Tahoma" w:hAnsi="Tahoma" w:cs="Tahoma"/>
+      <w:sz w:val="16"/>
+      <w:szCs w:val="16"/>
+    </w:rPr>
+  </w:style>
+  <w:style w:type="paragraph" w:styleId="ab">
+    <w:name w:val="caption"/>
+    <w:basedOn w:val="a"/>
+    <w:next w:val="a"/>
+    <w:uiPriority w:val="35"/>
+    <w:unhideWhenUsed/>
+    <w:qFormat/>
+    <w:rsid w:val="000D4660"/>
+    <w:pPr>
+      <w:spacing w:line="240" w:lineRule="auto"/>
+    </w:pPr>
+    <w:rPr>
+      <w:b/>
+      <w:bCs/>
+      <w:color w:val="4F81BD" w:themeColor="accent1"/>
+      <w:sz w:val="18"/>
+      <w:szCs w:val="18"/>
+    </w:rPr>
+  </w:style>
 </w:styles>
 </file>
 

</xml_diff>

<commit_message>
Created documentation for Lab2
</commit_message>
<xml_diff>
--- a/docs/lab2.docx
+++ b/docs/lab2.docx
@@ -1251,6 +1251,15 @@
           <w:sz w:val="28"/>
           <w:szCs w:val="28"/>
         </w:rPr>
+        <w:t>1.</w:t>
+      </w:r>
+      <w:r>
+        <w:rPr>
+          <w:b w:val="0"/>
+          <w:color w:val="000000" w:themeColor="text1"/>
+          <w:sz w:val="28"/>
+          <w:szCs w:val="28"/>
+        </w:rPr>
         <w:fldChar w:fldCharType="begin"/>
       </w:r>
       <w:r>
@@ -1364,6 +1373,195 @@
         </w:rPr>
         <w:t xml:space="preserve"> с добавлением модифицированных атрибутов</w:t>
       </w:r>
+      <w:r>
+        <w:rPr>
+          <w:rFonts w:ascii="Times New Roman" w:hAnsi="Times New Roman" w:cs="Times New Roman"/>
+          <w:sz w:val="28"/>
+          <w:szCs w:val="28"/>
+        </w:rPr>
+        <w:t xml:space="preserve"> определения объектов в БД. Благодаря архитектуре приложения </w:t>
+      </w:r>
+      <w:r>
+        <w:rPr>
+          <w:rFonts w:ascii="Times New Roman" w:hAnsi="Times New Roman" w:cs="Times New Roman"/>
+          <w:sz w:val="28"/>
+          <w:szCs w:val="28"/>
+          <w:lang w:val="en-US"/>
+        </w:rPr>
+        <w:t>Model</w:t>
+      </w:r>
+      <w:r>
+        <w:rPr>
+          <w:rFonts w:ascii="Times New Roman" w:hAnsi="Times New Roman" w:cs="Times New Roman"/>
+          <w:sz w:val="28"/>
+          <w:szCs w:val="28"/>
+        </w:rPr>
+        <w:t xml:space="preserve"> – </w:t>
+      </w:r>
+      <w:r>
+        <w:rPr>
+          <w:rFonts w:ascii="Times New Roman" w:hAnsi="Times New Roman" w:cs="Times New Roman"/>
+          <w:sz w:val="28"/>
+          <w:szCs w:val="28"/>
+          <w:lang w:val="en-US"/>
+        </w:rPr>
+        <w:t>View</w:t>
+      </w:r>
+      <w:r>
+        <w:rPr>
+          <w:rFonts w:ascii="Times New Roman" w:hAnsi="Times New Roman" w:cs="Times New Roman"/>
+          <w:sz w:val="28"/>
+          <w:szCs w:val="28"/>
+        </w:rPr>
+        <w:t xml:space="preserve"> </w:t>
+      </w:r>
+      <w:r>
+        <w:rPr>
+          <w:rFonts w:ascii="Times New Roman" w:hAnsi="Times New Roman" w:cs="Times New Roman"/>
+          <w:sz w:val="28"/>
+          <w:szCs w:val="28"/>
+        </w:rPr>
+        <w:t>достижение цели обошлось в минимум изменений в связи со слабой связностью приложения. Поэтому при тестировании приложения, а именно при его запуске, в главном окне приложения высвечиваются все созданные ранее заметки.</w:t>
+      </w:r>
+    </w:p>
+    <w:p>
+      <w:pPr>
+        <w:keepNext/>
+        <w:spacing w:after="0" w:line="240" w:lineRule="auto"/>
+        <w:jc w:val="center"/>
+      </w:pPr>
+      <w:r>
+        <w:rPr>
+          <w:rFonts w:ascii="Times New Roman" w:hAnsi="Times New Roman" w:cs="Times New Roman"/>
+          <w:noProof/>
+          <w:sz w:val="28"/>
+          <w:szCs w:val="28"/>
+          <w:lang w:eastAsia="ru-RU"/>
+        </w:rPr>
+        <w:drawing>
+          <wp:inline distT="0" distB="0" distL="0" distR="0">
+            <wp:extent cx="5105400" cy="6637020"/>
+            <wp:effectExtent l="19050" t="0" r="0" b="0"/>
+            <wp:docPr id="4" name="Рисунок 4"/>
+            <wp:cNvGraphicFramePr>
+              <a:graphicFrameLocks xmlns:a="http://schemas.openxmlformats.org/drawingml/2006/main" noChangeAspect="1"/>
+            </wp:cNvGraphicFramePr>
+            <a:graphic xmlns:a="http://schemas.openxmlformats.org/drawingml/2006/main">
+              <a:graphicData uri="http://schemas.openxmlformats.org/drawingml/2006/picture">
+                <pic:pic xmlns:pic="http://schemas.openxmlformats.org/drawingml/2006/picture">
+                  <pic:nvPicPr>
+                    <pic:cNvPr id="0" name="Picture 4"/>
+                    <pic:cNvPicPr>
+                      <a:picLocks noChangeAspect="1" noChangeArrowheads="1"/>
+                    </pic:cNvPicPr>
+                  </pic:nvPicPr>
+                  <pic:blipFill>
+                    <a:blip r:embed="rId8"/>
+                    <a:srcRect/>
+                    <a:stretch>
+                      <a:fillRect/>
+                    </a:stretch>
+                  </pic:blipFill>
+                  <pic:spPr bwMode="auto">
+                    <a:xfrm>
+                      <a:off x="0" y="0"/>
+                      <a:ext cx="5105400" cy="6637020"/>
+                    </a:xfrm>
+                    <a:prstGeom prst="rect">
+                      <a:avLst/>
+                    </a:prstGeom>
+                    <a:noFill/>
+                    <a:ln w="9525">
+                      <a:noFill/>
+                      <a:miter lim="800000"/>
+                      <a:headEnd/>
+                      <a:tailEnd/>
+                    </a:ln>
+                  </pic:spPr>
+                </pic:pic>
+              </a:graphicData>
+            </a:graphic>
+          </wp:inline>
+        </w:drawing>
+      </w:r>
+    </w:p>
+    <w:p>
+      <w:pPr>
+        <w:pStyle w:val="ab"/>
+        <w:spacing w:after="0"/>
+        <w:jc w:val="center"/>
+        <w:rPr>
+          <w:rFonts w:ascii="Times New Roman" w:hAnsi="Times New Roman" w:cs="Times New Roman"/>
+          <w:b w:val="0"/>
+          <w:color w:val="000000" w:themeColor="text1"/>
+          <w:sz w:val="28"/>
+          <w:szCs w:val="28"/>
+        </w:rPr>
+      </w:pPr>
+      <w:r>
+        <w:rPr>
+          <w:b w:val="0"/>
+          <w:color w:val="000000" w:themeColor="text1"/>
+          <w:sz w:val="28"/>
+          <w:szCs w:val="28"/>
+        </w:rPr>
+        <w:t xml:space="preserve">Рисунок </w:t>
+      </w:r>
+      <w:r>
+        <w:rPr>
+          <w:b w:val="0"/>
+          <w:color w:val="000000" w:themeColor="text1"/>
+          <w:sz w:val="28"/>
+          <w:szCs w:val="28"/>
+        </w:rPr>
+        <w:fldChar w:fldCharType="begin"/>
+      </w:r>
+      <w:r>
+        <w:rPr>
+          <w:b w:val="0"/>
+          <w:color w:val="000000" w:themeColor="text1"/>
+          <w:sz w:val="28"/>
+          <w:szCs w:val="28"/>
+        </w:rPr>
+        <w:instrText xml:space="preserve"> SEQ Рисунок \* ARABIC </w:instrText>
+      </w:r>
+      <w:r>
+        <w:rPr>
+          <w:b w:val="0"/>
+          <w:color w:val="000000" w:themeColor="text1"/>
+          <w:sz w:val="28"/>
+          <w:szCs w:val="28"/>
+        </w:rPr>
+        <w:fldChar w:fldCharType="separate"/>
+      </w:r>
+      <w:r>
+        <w:rPr>
+          <w:b w:val="0"/>
+          <w:noProof/>
+          <w:color w:val="000000" w:themeColor="text1"/>
+          <w:sz w:val="28"/>
+          <w:szCs w:val="28"/>
+        </w:rPr>
+        <w:t>2</w:t>
+      </w:r>
+      <w:r>
+        <w:rPr>
+          <w:b w:val="0"/>
+          <w:color w:val="000000" w:themeColor="text1"/>
+          <w:sz w:val="28"/>
+          <w:szCs w:val="28"/>
+        </w:rPr>
+        <w:fldChar w:fldCharType="end"/>
+      </w:r>
+      <w:r>
+        <w:rPr>
+          <w:b w:val="0"/>
+          <w:color w:val="000000" w:themeColor="text1"/>
+          <w:sz w:val="28"/>
+          <w:szCs w:val="28"/>
+        </w:rPr>
+        <w:t xml:space="preserve"> - Сохранение созданных заметок</w:t>
+      </w:r>
     </w:p>
     <w:p>
       <w:pPr>
@@ -1392,8 +1590,44 @@
           <w:sz w:val="28"/>
           <w:szCs w:val="28"/>
         </w:rPr>
+        <w:lastRenderedPageBreak/>
         <w:tab/>
       </w:r>
+      <w:r>
+        <w:rPr>
+          <w:rFonts w:ascii="Times New Roman" w:hAnsi="Times New Roman" w:cs="Times New Roman"/>
+          <w:sz w:val="28"/>
+          <w:szCs w:val="28"/>
+        </w:rPr>
+        <w:t>При создани</w:t>
+      </w:r>
+      <w:r>
+        <w:rPr>
+          <w:rFonts w:ascii="Times New Roman" w:hAnsi="Times New Roman" w:cs="Times New Roman"/>
+          <w:sz w:val="28"/>
+          <w:szCs w:val="28"/>
+        </w:rPr>
+        <w:t>и, изменении и удалении заметок вносятся изменения в локальную базу данных, что позволяет обеспечивать кэширование и сохранение состояния приложения.</w:t>
+      </w:r>
+    </w:p>
+    <w:p>
+      <w:pPr>
+        <w:rPr>
+          <w:rFonts w:ascii="Times New Roman" w:hAnsi="Times New Roman" w:cs="Times New Roman"/>
+          <w:b/>
+          <w:sz w:val="28"/>
+          <w:szCs w:val="28"/>
+        </w:rPr>
+      </w:pPr>
+      <w:r>
+        <w:rPr>
+          <w:rFonts w:ascii="Times New Roman" w:hAnsi="Times New Roman" w:cs="Times New Roman"/>
+          <w:b/>
+          <w:sz w:val="28"/>
+          <w:szCs w:val="28"/>
+        </w:rPr>
+        <w:br w:type="page"/>
+      </w:r>
     </w:p>
     <w:p>
       <w:pPr>
@@ -1413,6 +1647,7 @@
           <w:sz w:val="28"/>
           <w:szCs w:val="28"/>
         </w:rPr>
+        <w:lastRenderedPageBreak/>
         <w:t>ЗАКЛЮЧЕНИЕ</w:t>
       </w:r>
     </w:p>
@@ -1424,11 +1659,21 @@
           <w:rFonts w:ascii="Times New Roman" w:hAnsi="Times New Roman" w:cs="Times New Roman"/>
           <w:sz w:val="28"/>
           <w:szCs w:val="28"/>
-        </w:rPr>
-      </w:pPr>
+          <w:lang w:val="en-US"/>
+        </w:rPr>
+      </w:pPr>
+      <w:r>
+        <w:rPr>
+          <w:rFonts w:ascii="Times New Roman" w:hAnsi="Times New Roman" w:cs="Times New Roman"/>
+          <w:sz w:val="28"/>
+          <w:szCs w:val="28"/>
+        </w:rPr>
+        <w:tab/>
+        <w:t>Был изучен принцип хранения файлов, а также было доработано ранее созданное приложение с добавлением возможности сохранения созданных заметок и их изменений.</w:t>
+      </w:r>
     </w:p>
     <w:sectPr>
-      <w:footerReference w:type="default" r:id="rId8"/>
+      <w:footerReference w:type="default" r:id="rId9"/>
       <w:pgSz w:w="11906" w:h="16838"/>
       <w:pgMar w:top="1134" w:right="850" w:bottom="1134" w:left="1701" w:header="708" w:footer="708" w:gutter="0"/>
       <w:cols w:space="708"/>
@@ -1507,7 +1752,7 @@
             <w:sz w:val="28"/>
             <w:szCs w:val="28"/>
           </w:rPr>
-          <w:t>4</w:t>
+          <w:t>6</w:t>
         </w:r>
         <w:r>
           <w:rPr>

</xml_diff>